<commit_message>
codes: an unset row shade falls back to the form's colour instead of painting it black
</commit_message>
<xml_diff>
--- a/backend/documents/letter_templates/process_codes.docx
+++ b/backend/documents/letter_templates/process_codes.docx
@@ -457,7 +457,7 @@
         </w:trPr>
         <w:tc>
           <w:tcPr>
-            <w:shd w:fill="{{ r.shade }}" w:val="clear"/>
+            <w:shd w:fill="{{ r.shade | default('d9e7f9', true) }}" w:val="clear"/>
             <w:vAlign w:val="center"/>
           </w:tcPr>
           <w:p>
@@ -482,7 +482,7 @@
         </w:tc>
         <w:tc>
           <w:tcPr>
-            <w:shd w:fill="{{ r.shade }}" w:val="clear"/>
+            <w:shd w:fill="{{ r.shade | default('d9e7f9', true) }}" w:val="clear"/>
             <w:vAlign w:val="center"/>
           </w:tcPr>
           <w:p>
@@ -507,7 +507,7 @@
         </w:tc>
         <w:tc>
           <w:tcPr>
-            <w:shd w:fill="{{ r.shade }}" w:val="clear"/>
+            <w:shd w:fill="{{ r.shade | default('d9e7f9', true) }}" w:val="clear"/>
             <w:vAlign w:val="center"/>
           </w:tcPr>
           <w:p>
@@ -532,7 +532,7 @@
         </w:tc>
         <w:tc>
           <w:tcPr>
-            <w:shd w:fill="{{ r.shade }}" w:val="clear"/>
+            <w:shd w:fill="{{ r.shade | default('d9e7f9', true) }}" w:val="clear"/>
             <w:vAlign w:val="center"/>
           </w:tcPr>
           <w:p>
@@ -557,7 +557,7 @@
         </w:tc>
         <w:tc>
           <w:tcPr>
-            <w:shd w:fill="{{ r.shade }}" w:val="clear"/>
+            <w:shd w:fill="{{ r.shade | default('d9e7f9', true) }}" w:val="clear"/>
             <w:vAlign w:val="center"/>
           </w:tcPr>
           <w:p>

</xml_diff>